<commit_message>
fix: Mémoire de DEA + encadreur Professeur MABELA ROSTIN
Corrections:
- 'Mémoire de Licence' -> 'Mémoire de DEA'
- 'Licencié en Sciences Informatiques' -> 'Ingénieur en Sciences Informatiques'
- Encadreur: 'Prof. KASORO MULENDA Nathanaël' -> 'Professeur MABELA ROSTIN'
- Avant-propos: mention mise à jour avec le nouveau nom
- 'deuxième cycle' précisé avec 'cycle de spécialisation en vue de l'obtention du grade d'Ingénieur'

Vérifications (toutes ✅):
- MABELA ROSTIN: présent ✅
- KASORO MULENDA: supprimé ✅
- Mémoire de DEA: présent ✅
- Mémoire de Licence: supprimé ✅
- Ingénieur: présent ✅
- Licencié: supprimé ✅
- Placeholders: 0 ✅

Mémoire final: 95 pages PDF A4
</commit_message>
<xml_diff>
--- a/download/Memoire_KASOMBO_recadre.docx
+++ b/download/Memoire_KASOMBO_recadre.docx
@@ -99,7 +99,7 @@
           <w:sz w:val="22"/>
           <w:szCs w:val="22"/>
         </w:rPr>
-        <w:t xml:space="preserve">Mémoire de Licence présenté en vue de l'obtention du grade de Licencié en Sciences Informatiques</w:t>
+        <w:t xml:space="preserve">Mémoire de DEA présenté en vue de l'obtention du grade d'Ingénieur en Sciences Informatiques</w:t>
       </w:r>
     </w:p>
     <w:p>
@@ -337,7 +337,7 @@
                 <w:sz w:val="26"/>
                 <w:szCs w:val="26"/>
               </w:rPr>
-              <w:t xml:space="preserve">Mémoire de Licence</w:t>
+              <w:t xml:space="preserve">Mémoire de DEA</w:t>
             </w:r>
           </w:p>
         </w:tc>
@@ -475,7 +475,7 @@
                 <w:sz w:val="26"/>
                 <w:szCs w:val="26"/>
               </w:rPr>
-              <w:t xml:space="preserve">Prof. KASORO MULENDA Nathanaël</w:t>
+              <w:t xml:space="preserve">Professeur MABELA ROSTIN</w:t>
             </w:r>
           </w:p>
         </w:tc>
@@ -6349,7 +6349,7 @@
           <w:sz w:val="24"/>
           <w:szCs w:val="24"/>
         </w:rPr>
-        <w:t xml:space="preserve">Ce travail sanctionne la fin du deuxième cycle à l'Université de Kinshasa, plus particulièrement à la Faculté des Sciences et Technologies au Département de Mathématiques et Informatique. De ce fait, qu'il nous soit permis d'exprimer notre gratitude à tous ceux qui de loin ou de près nous ont assistés tant moralement que matériellement dans l'élaboration de ce travail.</w:t>
+        <w:t xml:space="preserve">Ce travail sanctionne la fin du deuxième cycle, cycle de spécialisation en vue de l'obtention du grade d'Ingénieur à l'Université de Kinshasa, plus particulièrement à la Faculté des Sciences et Technologies au Département de Mathématiques et Informatique. De ce fait, qu'il nous soit permis d'exprimer notre gratitude à tous ceux qui de loin ou de près nous ont assistés tant moralement que matériellement dans l'élaboration de ce travail.</w:t>
       </w:r>
     </w:p>
     <w:p>
@@ -6365,7 +6365,7 @@
           <w:sz w:val="24"/>
           <w:szCs w:val="24"/>
         </w:rPr>
-        <w:t xml:space="preserve">Nos plus grands remerciements vont à l'endroit du Professeur KASORO MULENDA Nathanaël qui a accepté de diriger ce travail depuis l'imagination de l'auteur jusqu'à la réalisation de cette œuvre avec un maximum d'attention, et cela malgré ses nombreuses occupations.</w:t>
+        <w:t xml:space="preserve">Nos plus grands remerciements vont à l'endroit du Professeur MABELA ROSTIN qui a accepté de diriger ce travail depuis l'imagination de l'auteur jusqu'à la réalisation de cette œuvre avec un maximum d'attention, et cela malgré ses nombreuses occupations.</w:t>
       </w:r>
     </w:p>
     <w:p>

</xml_diff>